<commit_message>
Cadastra plano e franquia pela tela
/catalogo/planos lista, cria e edita plano; a edicao traz a franquia de cada
servico disponivel na faixa contratada.

O formulario recebe dinheiro como o operador digita e converte em centavos no
prepareForValidation, entao as regras numericas trabalham sobre inteiro. O
consumo minimo e validado contra as faixas da versao escolhida: sem isso da
para salvar um plano de R$ 300 numa versao com faixas de 75/200/500, e o erro
so apareceria no fechamento da fatura.

Franquia zero apaga a linha em vez de gravar zero — ausencia e zero significam
a mesma coisa na apuracao, e manter as duas representacoes criaria duvida. O
controller so aceita servico realmente precificado na faixa do plano, para que
id chutado no formulario nao vire franquia.

As rotas de versao passaram para /catalogo/versoes/{versao}: /catalogo/planos
cairia no parametro curinga.

Co-Authored-By: Claude Opus 5 <noreply@anthropic.com>
</commit_message>
<xml_diff>
--- a/docs/PDD-Avalia.docx
+++ b/docs/PDD-Avalia.docx
@@ -2426,17 +2426,22 @@
     </w:p>
     <w:p>
       <w:r>
-        <w:t>A tela de catálogo (/catalogo, restrita a administração) lista as versões,</w:t>
-      </w:r>
-    </w:p>
-    <w:p>
-      <w:r>
-        <w:t>mostra a matriz de preços por faixa e ativa uma versão em rascunho. Cadastro de</w:t>
-      </w:r>
-    </w:p>
-    <w:p>
-      <w:r>
-        <w:t>plano e de franquia ainda não têm tela.</w:t>
+        <w:t>As telas de catálogo (/catalogo, restritas a administração) listam as versões,</w:t>
+      </w:r>
+    </w:p>
+    <w:p>
+      <w:r>
+        <w:t>mostram a matriz de preços por faixa, ativam uma versão em rascunho e cadastram</w:t>
+      </w:r>
+    </w:p>
+    <w:p>
+      <w:r>
+        <w:t>planos com a franquia de cada serviço. Falta a tela de reajuste: hoje duplicar()</w:t>
+      </w:r>
+    </w:p>
+    <w:p>
+      <w:r>
+        <w:t>e a edição de preço de um rascunho só existem no model.</w:t>
       </w:r>
     </w:p>
     <w:p>

</xml_diff>

<commit_message>
Libera os servicos de SCR
Decisao comercial: relatorio-top-scr, prime-completa-scr e scr-score saem da
trava de liberacao e passam a entrar em plano. 43 de 43 servicos disponiveis.

Liberado no catalogo nao e o mesmo que consultavel: o conector nao existe. O
PDD registra que a homologacao juridica e a autorizacao expressa por consulta
continuam sendo pre-requisito da integracao, e que essa verificacao tera de
viver no proprio conector — a trava do catalogo nao a substitui.

O CatalogoSeeder deixa de sobrescrever exige_liberacao ao reimportar, pelo
mesmo motivo que ja nao sobrescrevia ativo: e decisao da administracao tomada
na tela. Sem isso, rodar o seeder de novo retravaria o SCR em silencio.

Co-Authored-By: Claude Opus 5 <noreply@anthropic.com>
</commit_message>
<xml_diff>
--- a/docs/PDD-Avalia.docx
+++ b/docs/PDD-Avalia.docx
@@ -1351,27 +1351,52 @@
     </w:p>
     <w:p>
       <w:r>
-        <w:t>SCR e Veicular têm catálogo e permissões implementados desde já, com a integração</w:t>
-      </w:r>
-    </w:p>
-    <w:p>
-      <w:r>
-        <w:t>externa desativada por feature flag. Nenhuma requisição a API, nem liberação</w:t>
-      </w:r>
-    </w:p>
-    <w:p>
-      <w:r>
-        <w:t>comercial, ocorre antes da homologação jurídica, contratual e técnica. O SCR</w:t>
-      </w:r>
-    </w:p>
-    <w:p>
-      <w:r>
-        <w:t>recebe nome comercial mascarado e depende ainda de autorização expressa</w:t>
-      </w:r>
-    </w:p>
-    <w:p>
-      <w:r>
-        <w:t>verificável para cada consulta.</w:t>
+        <w:t>SCR e Veicular têm catálogo e permissões implementados desde já. A trava por</w:t>
+      </w:r>
+    </w:p>
+    <w:p>
+      <w:r>
+        <w:t>serviço é operada na tela de Serviços: enquanto marcada, o serviço aparece no</w:t>
+      </w:r>
+    </w:p>
+    <w:p>
+      <w:r>
+        <w:t>catálogo e pode ser precificado, mas não entra em plano nenhum.</w:t>
+      </w:r>
+    </w:p>
+    <w:p>
+      <w:r>
+        <w:t>Os serviços de SCR foram liberados dessa trava por decisão comercial. Isso os</w:t>
+      </w:r>
+    </w:p>
+    <w:p>
+      <w:r>
+        <w:t>torna vendáveis no catálogo; não os torna consultáveis, porque o conector</w:t>
+      </w:r>
+    </w:p>
+    <w:p>
+      <w:r>
+        <w:t>ainda não existe. A homologação jurídica, contratual e técnica continua sendo</w:t>
+      </w:r>
+    </w:p>
+    <w:p>
+      <w:r>
+        <w:t>pré-requisito da integração, e o SCR depende de autorização expressa verificável</w:t>
+      </w:r>
+    </w:p>
+    <w:p>
+      <w:r>
+        <w:t>para cada consulta. Quando o módulo Consultas for construído, essa verificação</w:t>
+      </w:r>
+    </w:p>
+    <w:p>
+      <w:r>
+        <w:t>precisa existir no próprio conector — a trava do catálogo não a substitui.</w:t>
+      </w:r>
+    </w:p>
+    <w:p>
+      <w:r>
+        <w:t>O SCR recebe nome comercial mascarado.</w:t>
       </w:r>
     </w:p>
     <w:p>

</xml_diff>

<commit_message>
Tira os travessoes e o codigo morto do tema
152 travessoes espalhados por codigo, telas, dados e PDD. Cada um virou a
pontuacao que a frase pedia: virgula, dois pontos ou ponto final. Nao foi
substituicao cega.

Onde o travessao era dado, e nao prosa:

- os 43 nomes de servico passam a usar hifen ("SCPC BVS PF/PJ - Base III"). O
  gerador foi corrigido na origem, o arquivo regerado e os nomes sincronizados
  no banco;
- o marcador de valor ausente na matriz virou hifen simples.

Junto, tres restos que mentiam:

- componentes do tema sem nenhum uso (alert, avatar, badge, button, modal,
  youtube-embed) foram removidos, agora que x-avalia.botao ocupa o lugar;
- o CatalogoSeeder dizia "em rascunho: ative apos homologar", texto de quando
  existia versionamento de catalogo. Nao existe mais rascunho nem ativacao;
- comentarios que falavam em "travessao na tela" passam a falar em campo em
  branco, que e o que a tela mostra.

Co-Authored-By: Claude Opus 5 <noreply@anthropic.com>
</commit_message>
<xml_diff>
--- a/docs/PDD-Avalia.docx
+++ b/docs/PDD-Avalia.docx
@@ -7,7 +7,7 @@
         <w:pStyle w:val="Heading1"/>
       </w:pPr>
       <w:r>
-        <w:t>Documento de Produto — Avalia</w:t>
+        <w:t>Documento de Produto: Avalia</w:t>
       </w:r>
     </w:p>
     <w:p>
@@ -305,7 +305,7 @@
     </w:p>
     <w:p>
       <w:r>
-        <w:t>no catálogo versionado — nunca no código.</w:t>
+        <w:t>no catálogo versionado, nunca no código.</w:t>
       </w:r>
     </w:p>
     <w:tbl>
@@ -765,7 +765,7 @@
     </w:p>
     <w:p>
       <w:r>
-        <w:t>restrição de acesso do catálogo — vendedor não entra.</w:t>
+        <w:t>restrição de acesso do catálogo: vendedor não entra.</w:t>
       </w:r>
     </w:p>
     <w:p>
@@ -1391,7 +1391,7 @@
     </w:p>
     <w:p>
       <w:r>
-        <w:t>precisa existir no próprio conector — a trava do catálogo não a substitui.</w:t>
+        <w:t>precisa existir no próprio conector, porque a trava do catálogo não a substitui.</w:t>
       </w:r>
     </w:p>
     <w:p>
@@ -1908,12 +1908,12 @@
     </w:p>
     <w:p>
       <w:r>
-        <w:t>O valor é livre: quem define é o vendedor, na proposta. Pode ser parcelada — uma</w:t>
-      </w:r>
-    </w:p>
-    <w:p>
-      <w:r>
-        <w:t>adesão de R$ 12.000,00 em doze parcelas de R$ 1.000,00 é caso previsto — e cada</w:t>
+        <w:t>O valor é livre: quem define é o vendedor, na proposta. Pode ser parcelada, e</w:t>
+      </w:r>
+    </w:p>
+    <w:p>
+      <w:r>
+        <w:t>uma adesão de R$ 12.000,00 em doze parcelas de R$ 1.000,00 é caso previsto. Cada</w:t>
       </w:r>
     </w:p>
     <w:p>
@@ -2845,7 +2845,7 @@
     </w:p>
     <w:p>
       <w:r>
-        <w:t>  paga o mínimo sem usar gera comissão menor que o valor da fatura — confirmar se</w:t>
+        <w:t>  paga o mínimo sem usar gera comissão menor que o valor da fatura. Confirmar se</w:t>
       </w:r>
     </w:p>
     <w:p>
@@ -3010,7 +3010,7 @@
     </w:p>
     <w:p>
       <w:r>
-        <w:t>Ativar a versão é ação administrativa consciente — o seeder nunca ativa.</w:t>
+        <w:t>Ativar a versão é ação administrativa consciente: o seeder nunca ativa.</w:t>
       </w:r>
     </w:p>
     <w:p>
@@ -3023,7 +3023,7 @@
         <w:pStyle w:val="ListBullet"/>
       </w:pPr>
       <w:r>
-        <w:t>Planos — cadastro de plano, faixa contratada e franquia por serviço;</w:t>
+        <w:t>Planos: cadastro de plano, faixa contratada e franquia por serviço;</w:t>
       </w:r>
     </w:p>
     <w:p>
@@ -3031,7 +3031,7 @@
         <w:pStyle w:val="ListBullet"/>
       </w:pPr>
       <w:r>
-        <w:t>Catálogo — a matriz de preços por faixa, em três visões (venda, custo e</w:t>
+        <w:t>Catálogo: a matriz de preços por faixa, em três visões (venda, custo e</w:t>
       </w:r>
     </w:p>
     <w:p>
@@ -3044,7 +3044,7 @@
         <w:pStyle w:val="ListBullet"/>
       </w:pPr>
       <w:r>
-        <w:t>Serviços — cadastro, renomeação, categoria, ativação e trava de liberação</w:t>
+        <w:t>Serviços: cadastro, renomeação, categoria, ativação e trava de liberação</w:t>
       </w:r>
     </w:p>
     <w:p>
@@ -3102,7 +3102,7 @@
         <w:pStyle w:val="Heading2"/>
       </w:pPr>
       <w:r>
-        <w:t>Anexo A — Preços de referência: crédito</w:t>
+        <w:t>Anexo A. Preços de referência: crédito</w:t>
       </w:r>
     </w:p>
     <w:p>
@@ -3220,7 +3220,7 @@
           <w:tcPr/>
           <w:p>
             <w:r>
-              <w:t>Cheques sem fundos — Banco Central PF/PJ</w:t>
+              <w:t>Cheques sem fundos - Banco Central PF/PJ</w:t>
             </w:r>
           </w:p>
         </w:tc>
@@ -3286,7 +3286,7 @@
           <w:tcPr/>
           <w:p>
             <w:r>
-              <w:t>Ações judiciais — nacional PF/PJ</w:t>
+              <w:t>Ações judiciais - nacional PF/PJ</w:t>
             </w:r>
           </w:p>
         </w:tc>
@@ -3352,7 +3352,7 @@
           <w:tcPr/>
           <w:p>
             <w:r>
-              <w:t>SCPC BVS PF/PJ — Base III</w:t>
+              <w:t>SCPC BVS PF/PJ - Base III</w:t>
             </w:r>
           </w:p>
         </w:tc>
@@ -3418,7 +3418,7 @@
           <w:tcPr/>
           <w:p>
             <w:r>
-              <w:t>Relatório Plus PF/PJ + cartórios e CCF Bacen — Base III</w:t>
+              <w:t>Relatório Plus PF/PJ + cartórios e CCF Bacen - Base III</w:t>
             </w:r>
           </w:p>
         </w:tc>
@@ -3484,7 +3484,7 @@
           <w:tcPr/>
           <w:p>
             <w:r>
-              <w:t>Crédito Net Básica PF/PJ — Base I</w:t>
+              <w:t>Crédito Net Básica PF/PJ - Base I</w:t>
             </w:r>
           </w:p>
         </w:tc>
@@ -3550,7 +3550,7 @@
           <w:tcPr/>
           <w:p>
             <w:r>
-              <w:t>Mix PF/PJ — Base I e II</w:t>
+              <w:t>Mix PF/PJ - Base I e II</w:t>
             </w:r>
           </w:p>
         </w:tc>
@@ -3616,7 +3616,7 @@
           <w:tcPr/>
           <w:p>
             <w:r>
-              <w:t>Crédito Net PF/PJ — Base I e III</w:t>
+              <w:t>Crédito Net PF/PJ - Base I e III</w:t>
             </w:r>
           </w:p>
         </w:tc>
@@ -3682,7 +3682,7 @@
           <w:tcPr/>
           <w:p>
             <w:r>
-              <w:t>Crédito Net Top + cartórios e CCF Bacen — Base I e III</w:t>
+              <w:t>Crédito Net Top + cartórios e CCF Bacen - Base I e III</w:t>
             </w:r>
           </w:p>
         </w:tc>
@@ -3748,7 +3748,7 @@
           <w:tcPr/>
           <w:p>
             <w:r>
-              <w:t>Relatório Score Positivo + filtros — Base III</w:t>
+              <w:t>Relatório Score Positivo + filtros - Base III</w:t>
             </w:r>
           </w:p>
         </w:tc>
@@ -3814,7 +3814,7 @@
           <w:tcPr/>
           <w:p>
             <w:r>
-              <w:t>Risco de Crédito Top PF/PJ + filtros — Base I</w:t>
+              <w:t>Risco de Crédito Top PF/PJ + filtros - Base I</w:t>
             </w:r>
           </w:p>
         </w:tc>
@@ -3880,7 +3880,7 @@
           <w:tcPr/>
           <w:p>
             <w:r>
-              <w:t>Relatório Top PF/PJ + filtros — Base I e III</w:t>
+              <w:t>Relatório Top PF/PJ + filtros - Base I e III</w:t>
             </w:r>
           </w:p>
         </w:tc>
@@ -3946,7 +3946,7 @@
           <w:tcPr/>
           <w:p>
             <w:r>
-              <w:t>Relatório Top + SCR Bacen — Base I e III *</w:t>
+              <w:t>Relatório Top + SCR Bacen - Base I e III *</w:t>
             </w:r>
           </w:p>
         </w:tc>
@@ -4012,7 +4012,7 @@
           <w:tcPr/>
           <w:p>
             <w:r>
-              <w:t>Maxi Top PF/PJ + score e filtros — Base I e II</w:t>
+              <w:t>Maxi Top PF/PJ + score e filtros - Base I e II</w:t>
             </w:r>
           </w:p>
         </w:tc>
@@ -4078,7 +4078,7 @@
           <w:tcPr/>
           <w:p>
             <w:r>
-              <w:t>Relatório Prime Básica + cartórios e CCF Bacen — Base I, II e III</w:t>
+              <w:t>Relatório Prime Básica + cartórios e CCF Bacen - Base I, II e III</w:t>
             </w:r>
           </w:p>
         </w:tc>
@@ -4144,7 +4144,7 @@
           <w:tcPr/>
           <w:p>
             <w:r>
-              <w:t>Relatório Prime Completa + filtros — Base I, II e III</w:t>
+              <w:t>Relatório Prime Completa + filtros - Base I, II e III</w:t>
             </w:r>
           </w:p>
         </w:tc>
@@ -4210,7 +4210,7 @@
           <w:tcPr/>
           <w:p>
             <w:r>
-              <w:t>Relatório Prime Completa + SCR Bacen — Base I, II e III *</w:t>
+              <w:t>Relatório Prime Completa + SCR Bacen - Base I, II e III *</w:t>
             </w:r>
           </w:p>
         </w:tc>
@@ -4342,7 +4342,7 @@
           <w:tcPr/>
           <w:p>
             <w:r>
-              <w:t>Cadastro especial PF — endereço, telefone, e-mail, trabalho, renda</w:t>
+              <w:t>Cadastro especial PF - endereço, telefone, e-mail, trabalho, renda</w:t>
             </w:r>
           </w:p>
         </w:tc>
@@ -4408,7 +4408,7 @@
           <w:tcPr/>
           <w:p>
             <w:r>
-              <w:t>Cadastro especial PJ — dados da empresa, sócios, regime fiscal, faturamento</w:t>
+              <w:t>Cadastro especial PJ - dados da empresa, sócios, regime fiscal, faturamento</w:t>
             </w:r>
           </w:p>
         </w:tc>
@@ -4606,7 +4606,7 @@
           <w:tcPr/>
           <w:p>
             <w:r>
-              <w:t>InfoBusca por CPF/CNPJ — telefone, endereço e e-mails</w:t>
+              <w:t>InfoBusca por CPF/CNPJ - telefone, endereço e e-mails</w:t>
             </w:r>
           </w:p>
         </w:tc>
@@ -4952,7 +4952,7 @@
         <w:pStyle w:val="Heading2"/>
       </w:pPr>
       <w:r>
-        <w:t>Anexo B — Preços de referência: veicular</w:t>
+        <w:t>Anexo B. Preços de referência: veicular</w:t>
       </w:r>
     </w:p>
     <w:p>
@@ -5392,7 +5392,7 @@
           <w:tcPr/>
           <w:p>
             <w:r>
-              <w:t>RenaInf — infrações completa</w:t>
+              <w:t>RenaInf - infrações completa</w:t>
             </w:r>
           </w:p>
         </w:tc>
@@ -5458,7 +5458,7 @@
           <w:tcPr/>
           <w:p>
             <w:r>
-              <w:t>CRLV — documento de licenciamento</w:t>
+              <w:t>CRLV - documento de licenciamento</w:t>
             </w:r>
           </w:p>
         </w:tc>
@@ -5524,7 +5524,7 @@
           <w:tcPr/>
           <w:p>
             <w:r>
-              <w:t>BIN — base estadual e nacional</w:t>
+              <w:t>BIN - base estadual e nacional</w:t>
             </w:r>
           </w:p>
         </w:tc>
@@ -5590,7 +5590,7 @@
           <w:tcPr/>
           <w:p>
             <w:r>
-              <w:t>Leilão — Base I</w:t>
+              <w:t>Leilão - Base I</w:t>
             </w:r>
           </w:p>
         </w:tc>
@@ -5656,7 +5656,7 @@
           <w:tcPr/>
           <w:p>
             <w:r>
-              <w:t>Leilão conjugado completo + score do veículo — Base II</w:t>
+              <w:t>Leilão conjugado completo + score do veículo - Base II</w:t>
             </w:r>
           </w:p>
         </w:tc>
@@ -5722,7 +5722,7 @@
           <w:tcPr/>
           <w:p>
             <w:r>
-              <w:t>CSV — certificado de segurança veicular</w:t>
+              <w:t>CSV - certificado de segurança veicular</w:t>
             </w:r>
           </w:p>
         </w:tc>
@@ -6118,7 +6118,7 @@
           <w:tcPr/>
           <w:p>
             <w:r>
-              <w:t>VIP Car — informação completa do veículo</w:t>
+              <w:t>VIP Car - informação completa do veículo</w:t>
             </w:r>
           </w:p>
         </w:tc>

</xml_diff>